<commit_message>
Add Anthropic reference to HMM project report
Co-Authored-By: Claude Sonnet 5 <noreply@anthropic.com>
Claude-Session: https://claude.ai/code/session_01HYYuowkoKLXqBHj3pVGwAy
</commit_message>
<xml_diff>
--- a/week3-hmm-sequence-labeling/HMM_Project_Report.docx
+++ b/week3-hmm-sequence-labeling/HMM_Project_Report.docx
@@ -348,76 +348,20 @@
           <w:szCs w:val="18"/>
         </w:rPr>
         <w:t xml:space="preserve">def build_transition_counts(label_sequences):</w:t>
-      </w:r>
-      <w:r>
-        <w:rPr>
-          <w:rFonts w:ascii="Consolas" w:cs="Consolas" w:eastAsia="Consolas" w:hAnsi="Consolas"/>
-          <w:sz w:val="18"/>
-          <w:szCs w:val="18"/>
-        </w:rPr>
         <w:br/>
         <w:t xml:space="preserve">    counts = defaultdict(Counter)</w:t>
-      </w:r>
-      <w:r>
-        <w:rPr>
-          <w:rFonts w:ascii="Consolas" w:cs="Consolas" w:eastAsia="Consolas" w:hAnsi="Consolas"/>
-          <w:sz w:val="18"/>
-          <w:szCs w:val="18"/>
-        </w:rPr>
         <w:br/>
         <w:t xml:space="preserve">    for labels in label_sequences:</w:t>
-      </w:r>
-      <w:r>
-        <w:rPr>
-          <w:rFonts w:ascii="Consolas" w:cs="Consolas" w:eastAsia="Consolas" w:hAnsi="Consolas"/>
-          <w:sz w:val="18"/>
-          <w:szCs w:val="18"/>
-        </w:rPr>
         <w:br/>
         <w:t xml:space="preserve">        prev = START</w:t>
-      </w:r>
-      <w:r>
-        <w:rPr>
-          <w:rFonts w:ascii="Consolas" w:cs="Consolas" w:eastAsia="Consolas" w:hAnsi="Consolas"/>
-          <w:sz w:val="18"/>
-          <w:szCs w:val="18"/>
-        </w:rPr>
         <w:br/>
         <w:t xml:space="preserve">        for tag in labels:</w:t>
-      </w:r>
-      <w:r>
-        <w:rPr>
-          <w:rFonts w:ascii="Consolas" w:cs="Consolas" w:eastAsia="Consolas" w:hAnsi="Consolas"/>
-          <w:sz w:val="18"/>
-          <w:szCs w:val="18"/>
-        </w:rPr>
         <w:br/>
         <w:t xml:space="preserve">            counts[prev][tag] += 1</w:t>
-      </w:r>
-      <w:r>
-        <w:rPr>
-          <w:rFonts w:ascii="Consolas" w:cs="Consolas" w:eastAsia="Consolas" w:hAnsi="Consolas"/>
-          <w:sz w:val="18"/>
-          <w:szCs w:val="18"/>
-        </w:rPr>
         <w:br/>
         <w:t xml:space="preserve">            prev = tag</w:t>
-      </w:r>
-      <w:r>
-        <w:rPr>
-          <w:rFonts w:ascii="Consolas" w:cs="Consolas" w:eastAsia="Consolas" w:hAnsi="Consolas"/>
-          <w:sz w:val="18"/>
-          <w:szCs w:val="18"/>
-        </w:rPr>
         <w:br/>
         <w:t xml:space="preserve">        counts[prev][END] += 1</w:t>
-      </w:r>
-      <w:r>
-        <w:rPr>
-          <w:rFonts w:ascii="Consolas" w:cs="Consolas" w:eastAsia="Consolas" w:hAnsi="Consolas"/>
-          <w:sz w:val="18"/>
-          <w:szCs w:val="18"/>
-        </w:rPr>
         <w:br/>
         <w:t xml:space="preserve">    return counts</w:t>
       </w:r>
@@ -440,31 +384,10 @@
           <w:szCs w:val="18"/>
         </w:rPr>
         <w:t xml:space="preserve">def transition_prob(self, prev_tag, tag):</w:t>
-      </w:r>
-      <w:r>
-        <w:rPr>
-          <w:rFonts w:ascii="Consolas" w:cs="Consolas" w:eastAsia="Consolas" w:hAnsi="Consolas"/>
-          <w:sz w:val="18"/>
-          <w:szCs w:val="18"/>
-        </w:rPr>
         <w:br/>
         <w:t xml:space="preserve">    counts = self.transition_counts[prev_tag]</w:t>
-      </w:r>
-      <w:r>
-        <w:rPr>
-          <w:rFonts w:ascii="Consolas" w:cs="Consolas" w:eastAsia="Consolas" w:hAnsi="Consolas"/>
-          <w:sz w:val="18"/>
-          <w:szCs w:val="18"/>
-        </w:rPr>
         <w:br/>
         <w:t xml:space="preserve">    total = sum(counts.values())</w:t>
-      </w:r>
-      <w:r>
-        <w:rPr>
-          <w:rFonts w:ascii="Consolas" w:cs="Consolas" w:eastAsia="Consolas" w:hAnsi="Consolas"/>
-          <w:sz w:val="18"/>
-          <w:szCs w:val="18"/>
-        </w:rPr>
         <w:br/>
         <w:t xml:space="preserve">    return (counts[tag] + 1) / (total + len(self.tagset) + 1)</w:t>
       </w:r>
@@ -487,67 +410,18 @@
           <w:szCs w:val="18"/>
         </w:rPr>
         <w:t xml:space="preserve"># Viterbi core step</w:t>
-      </w:r>
-      <w:r>
-        <w:rPr>
-          <w:rFonts w:ascii="Consolas" w:cs="Consolas" w:eastAsia="Consolas" w:hAnsi="Consolas"/>
-          <w:sz w:val="18"/>
-          <w:szCs w:val="18"/>
-        </w:rPr>
         <w:br/>
         <w:t xml:space="preserve">for tag in self.tagset:</w:t>
-      </w:r>
-      <w:r>
-        <w:rPr>
-          <w:rFonts w:ascii="Consolas" w:cs="Consolas" w:eastAsia="Consolas" w:hAnsi="Consolas"/>
-          <w:sz w:val="18"/>
-          <w:szCs w:val="18"/>
-        </w:rPr>
         <w:br/>
         <w:t xml:space="preserve">    best_prob, best_prev = max(</w:t>
-      </w:r>
-      <w:r>
-        <w:rPr>
-          <w:rFonts w:ascii="Consolas" w:cs="Consolas" w:eastAsia="Consolas" w:hAnsi="Consolas"/>
-          <w:sz w:val="18"/>
-          <w:szCs w:val="18"/>
-        </w:rPr>
         <w:br/>
         <w:t xml:space="preserve">        (viterbi[i-1][prev_tag] * self.transition_prob(prev_tag, tag)</w:t>
-      </w:r>
-      <w:r>
-        <w:rPr>
-          <w:rFonts w:ascii="Consolas" w:cs="Consolas" w:eastAsia="Consolas" w:hAnsi="Consolas"/>
-          <w:sz w:val="18"/>
-          <w:szCs w:val="18"/>
-        </w:rPr>
         <w:br/>
         <w:t xml:space="preserve">         * self.emission_prob(tag, word), prev_tag)</w:t>
-      </w:r>
-      <w:r>
-        <w:rPr>
-          <w:rFonts w:ascii="Consolas" w:cs="Consolas" w:eastAsia="Consolas" w:hAnsi="Consolas"/>
-          <w:sz w:val="18"/>
-          <w:szCs w:val="18"/>
-        </w:rPr>
         <w:br/>
         <w:t xml:space="preserve">        for prev_tag in self.tagset)</w:t>
-      </w:r>
-      <w:r>
-        <w:rPr>
-          <w:rFonts w:ascii="Consolas" w:cs="Consolas" w:eastAsia="Consolas" w:hAnsi="Consolas"/>
-          <w:sz w:val="18"/>
-          <w:szCs w:val="18"/>
-        </w:rPr>
         <w:br/>
         <w:t xml:space="preserve">    viterbi[i][tag] = best_prob</w:t>
-      </w:r>
-      <w:r>
-        <w:rPr>
-          <w:rFonts w:ascii="Consolas" w:cs="Consolas" w:eastAsia="Consolas" w:hAnsi="Consolas"/>
-          <w:sz w:val="18"/>
-          <w:szCs w:val="18"/>
-        </w:rPr>
         <w:br/>
         <w:t xml:space="preserve">    backpointer[i][tag] = best_prev</w:t>
       </w:r>
@@ -582,13 +456,6 @@
           <w:szCs w:val="18"/>
         </w:rPr>
         <w:t xml:space="preserve">Sentence  : the student develops software</w:t>
-      </w:r>
-      <w:r>
-        <w:rPr>
-          <w:rFonts w:ascii="Consolas" w:cs="Consolas" w:eastAsia="Consolas" w:hAnsi="Consolas"/>
-          <w:sz w:val="18"/>
-          <w:szCs w:val="18"/>
-        </w:rPr>
         <w:br/>
         <w:t xml:space="preserve">Predicted : DT NN VB DT</w:t>
       </w:r>
@@ -1070,6 +937,18 @@
         <w:t xml:space="preserve">Viterbi, A. (1967) 'Error bounds for convolutional codes and an asymptotically optimum decoding algorithm', IEEE Transactions on Information Theory, 13(2), pp. 260–269.</w:t>
       </w:r>
     </w:p>
+    <w:p>
+      <w:pPr>
+        <w:spacing w:after="160"/>
+      </w:pPr>
+      <w:r>
+        <w:rPr>
+          <w:sz w:val="22"/>
+          <w:szCs w:val="22"/>
+        </w:rPr>
+        <w:t xml:space="preserve">Anthropic (2026) Claude [Large language model]. Available at: https://www.anthropic.com (Accessed: 4 October 2026).</w:t>
+      </w:r>
+    </w:p>
     <w:sectPr>
       <w:pgSz w:w="12240" w:h="15840" w:orient="portrait"/>
       <w:pgMar w:top="1440" w:right="1440" w:bottom="1440" w:left="1440" w:header="708" w:footer="708" w:gutter="0"/>

</xml_diff>